<commit_message>
IMPORTAT: Se agrega personaje en 3era persona
</commit_message>
<xml_diff>
--- a/Assets/AI/Documentacion/Arquitectura_Tecnica_SilicaII.docx
+++ b/Assets/AI/Documentacion/Arquitectura_Tecnica_SilicaII.docx
@@ -9005,6 +9005,51 @@
       </w:pPr>
       <w:r>
         <w:t>Probar menu, nueva partida, cargar, checkpoint, restore, opciones, pausa y autosave.</w:t>
+      </w:r>
+    </w:p>
+    <w:p>
+      <w:r>
+        <w:br w:type="page"/>
+      </w:r>
+    </w:p>
+    <w:p>
+      <w:pPr>
+        <w:pStyle w:val="Heading1"/>
+      </w:pPr>
+      <w:r>
+        <w:t>Actualizacion - Player Perspective</w:t>
+      </w:r>
+    </w:p>
+    <w:p>
+      <w:pPr>
+        <w:pStyle w:val="ListBullet"/>
+      </w:pPr>
+      <w:r>
+        <w:t>La alternancia entre primera y tercera persona se integra como presentacion del Player existente. No se introduce un segundo controlador de movimiento ni un segundo sistema de input.</w:t>
+      </w:r>
+    </w:p>
+    <w:p>
+      <w:pPr>
+        <w:pStyle w:val="ListBullet"/>
+      </w:pPr>
+      <w:r>
+        <w:t>PlayerInputHandler consume la accion Player.Camera y delega en PlayerPerspectiveController. MovementController sigue siendo la fuente de movimiento y PlayerCameraRig sigue recibiendo el look input centralizado.</w:t>
+      </w:r>
+    </w:p>
+    <w:p>
+      <w:pPr>
+        <w:pStyle w:val="ListBullet"/>
+      </w:pPr>
+      <w:r>
+        <w:t>PlayerAnimatorPresenter lee MovementController y actualiza el Animator del modelo 3P. No lee input directamente y no mueve al jugador.</w:t>
+      </w:r>
+    </w:p>
+    <w:p>
+      <w:pPr>
+        <w:pStyle w:val="ListBullet"/>
+      </w:pPr>
+      <w:r>
+        <w:t>El import PlayerTest conserva modelo, material, animaciones y audio fuente. Se removieron scripts Starter Assets, PlayerInput propio, respawn local, audio local y componentes de camara/listener del prefab visual.</w:t>
       </w:r>
     </w:p>
     <w:sectPr>

</xml_diff>

<commit_message>
ruido de probar personajes
</commit_message>
<xml_diff>
--- a/Assets/AI/Documentacion/Arquitectura_Tecnica_SilicaII.docx
+++ b/Assets/AI/Documentacion/Arquitectura_Tecnica_SilicaII.docx
@@ -9050,6 +9050,155 @@
       </w:pPr>
       <w:r>
         <w:t>El import PlayerTest conserva modelo, material, animaciones y audio fuente. Se removieron scripts Starter Assets, PlayerInput propio, respawn local, audio local y componentes de camara/listener del prefab visual.</w:t>
+      </w:r>
+    </w:p>
+    <w:p>
+      <w:r>
+        <w:br w:type="page"/>
+      </w:r>
+    </w:p>
+    <w:p>
+      <w:pPr>
+        <w:pStyle w:val="Heading1"/>
+      </w:pPr>
+      <w:r>
+        <w:t>Integracion aplicada: perspectiva primera/tercera persona</w:t>
+      </w:r>
+    </w:p>
+    <w:p>
+      <w:pPr>
+        <w:pStyle w:val="ListBullet"/>
+      </w:pPr>
+      <w:r>
+        <w:t>El Player funcional sigue siendo el objeto Player de la escena Pablo_TestMechanics.unity. La tercera persona no introduce un segundo controlador de input, movimiento, inventario, scanner o SaveLoad.</w:t>
+      </w:r>
+    </w:p>
+    <w:p>
+      <w:pPr>
+        <w:pStyle w:val="ListBullet"/>
+      </w:pPr>
+      <w:r>
+        <w:t>PlayerInputHandler referencia por Inspector a PlayerPerspectiveController. La accion Player.Camera alterna el modo de perspectiva. Si la referencia falta, el sistema debe advertir y no ejecutar el cambio.</w:t>
+      </w:r>
+    </w:p>
+    <w:p>
+      <w:pPr>
+        <w:pStyle w:val="ListBullet"/>
+      </w:pPr>
+      <w:r>
+        <w:t>PlayerPerspectiveController activa/desactiva el visual PlayerRobotVisual y ajusta la posicion local de la camara compartida. PlayerAnimatorPresenter observa MovementController y alimenta el Animator del visual de tercera persona.</w:t>
+      </w:r>
+    </w:p>
+    <w:p>
+      <w:pPr>
+        <w:pStyle w:val="ListBullet"/>
+      </w:pPr>
+      <w:r>
+        <w:t>Assets/PlayerTest/Prefabs/PlayerRobot.prefab se mantiene como asset visual-only. No debe contener camara, AudioListener, CharacterController, input, movimiento, inventario, scanner, servicios ni UI propia.</w:t>
+      </w:r>
+    </w:p>
+    <w:p>
+      <w:pPr>
+        <w:pStyle w:val="Heading2"/>
+      </w:pPr>
+      <w:r>
+        <w:t>Ajuste de Inspector: perspectiva compartida</w:t>
+      </w:r>
+    </w:p>
+    <w:p>
+      <w:r>
+        <w:t>PlayerPerspectiveController debe exponer solo las referencias necesarias para la configuracion actual: Third Person Visual Root y Shared Camera Transform. Los roots separados de primera/tercera persona no forman parte del flujo vigente y no deben aparecer como campos vacios en Inspector.</w:t>
+      </w:r>
+    </w:p>
+    <w:p>
+      <w:pPr>
+        <w:pStyle w:val="Heading2"/>
+      </w:pPr>
+      <w:r>
+        <w:t>Ajuste vigente: robot visible y perspectiva por camara</w:t>
+      </w:r>
+    </w:p>
+    <w:p>
+      <w:r>
+        <w:t>PlayerRobotVisual debe permanecer visible como cuerpo del Player. PlayerPerspectiveController ya no administra activacion de visuales; su responsabilidad vigente es alternar los offsets de la Main Camera compartida entre primera y tercera persona.</w:t>
+      </w:r>
+    </w:p>
+    <w:p>
+      <w:pPr>
+        <w:pStyle w:val="Heading2"/>
+      </w:pPr>
+      <w:r>
+        <w:t>Audio de pasos por eventos de animacion</w:t>
+      </w:r>
+    </w:p>
+    <w:p>
+      <w:r>
+        <w:t>Los clips de locomocion del robot emiten AnimationEvent OnFootstep. El componente PlayerFootstepAnimationEvents vive en el GameObject Robot que contiene el Animator y delega en PlayerAudioFeedback. PlayerAudioFeedback conserva la decision de superficie, pitch y AudioCueKey, mientras AudioService reproduce el cue como one-shot. No se reintroducen scripts StarterAssets ni audio acoplado al controlador de movimiento.</w:t>
+      </w:r>
+    </w:p>
+    <w:p>
+      <w:pPr>
+        <w:pStyle w:val="Heading2"/>
+      </w:pPr>
+      <w:r>
+        <w:t>Eventos de aterrizaje del Animator</w:t>
+      </w:r>
+    </w:p>
+    <w:p>
+      <w:r>
+        <w:t>El mismo componente PlayerFootstepAnimationEvents tambien recibe AnimationEvent OnLand desde JumpLand y delega en PlayerAudioFeedback.PlayLanding. Esto evita warnings de Unity sin reintroducir scripts importados y mantiene la seleccion de superficie/audio en PlayerAudioFeedback.</w:t>
+      </w:r>
+    </w:p>
+    <w:p>
+      <w:pPr>
+        <w:pStyle w:val="Heading2"/>
+      </w:pPr>
+      <w:r>
+        <w:t>Sonido de inicio de salto</w:t>
+      </w:r>
+    </w:p>
+    <w:p>
+      <w:r>
+        <w:t>MovementController publica OnJumped cuando recibe una solicitud de salto valida estando grounded. PlayerAudioFeedback escucha ese evento y reproduce PlayerJump o PlayerMetalJump como one-shot. El aterrizaje puede sonar por OnLand del Animator o por OnLanded del MovementController.</w:t>
+      </w:r>
+    </w:p>
+    <w:p>
+      <w:pPr>
+        <w:pStyle w:val="Heading2"/>
+      </w:pPr>
+      <w:r>
+        <w:t>Fallback de audio por superficie</w:t>
+      </w:r>
+    </w:p>
+    <w:p>
+      <w:r>
+        <w:t>PlayerAudioFeedback selecciona WalkBase y JumpBase como sonidos por defecto. Si el tag de ground contiene Metal usa PlayerMetalWalk/PlayerMetalJump; si contiene Grass usa PlayerWalk/PlayerJump. Esta regla evita depender de un tag exacto y mantiene un fallback funcional para cualquier otra superficie.</w:t>
+      </w:r>
+    </w:p>
+    <w:p>
+      <w:pPr>
+        <w:pStyle w:val="Heading2"/>
+      </w:pPr>
+      <w:r>
+        <w:t>Filtros de repeticion en audio de locomocion</w:t>
+      </w:r>
+    </w:p>
+    <w:p>
+      <w:r>
+        <w:t>PlayerAudioFeedback no reproduce cada AnimationEvent ciegamente: filtra pasos por velocidad horizontal minima e intervalo minimo distinto para caminar/correr. El aterrizaje usa OnLand del Animator como fuente principal y desactiva el duplicado de MovementController.OnLanded salvo que se cambie landingUsesAnimationEvent.</w:t>
+      </w:r>
+    </w:p>
+    <w:p>
+      <w:pPr>
+        <w:pStyle w:val="Heading2"/>
+      </w:pPr>
+      <w:r>
+        <w:t>Correccion: locomocion solo por AnimationEvents</w:t>
+      </w:r>
+    </w:p>
+    <w:p>
+      <w:r>
+        <w:t>Los pasos y aterrizajes del Player no deben depender de timers, velocidad minima ni eventos de salto del MovementController. La fuente de verdad para Walk/Run/Land es el Animator mediante OnFootstep y OnLand. El jetpack sigue siendo la unica excepcion porque es audio sostenido por estado.</w:t>
       </w:r>
     </w:p>
     <w:sectPr>

</xml_diff>

<commit_message>
actualizacion final menu principal
</commit_message>
<xml_diff>
--- a/Assets/AI/Documentacion/Arquitectura_Tecnica_SilicaII.docx
+++ b/Assets/AI/Documentacion/Arquitectura_Tecnica_SilicaII.docx
@@ -583,7 +583,7 @@
         <w:pStyle w:val="ListBullet"/>
       </w:pPr>
       <w:r>
-        <w:t>SaveLoad debe persistir mediante ISaveParticipant y SaveParticipantRegistry.</w:t>
+        <w:t>SaveLoad debe persistir mediante ISaveParticipant y SaveParticipantRegistry. SaveParticipantRegistry usa participantBehaviours como ruta principal explicita; el auto-descubrimiento local queda solo como ayuda temporal de migracion y debe emitir warning.</w:t>
       </w:r>
     </w:p>
     <w:p>
@@ -615,7 +615,7 @@
         <w:pStyle w:val="ListBullet"/>
       </w:pPr>
       <w:r>
-        <w:t>Time.timeScale se controla desde GamePauseService, no desde botones o paneles concretos.</w:t>
+        <w:t>Time.timeScale se controla desde GamePauseService, no desde botones o paneles concretos. Los consumidores de pausa deben recibir GamePauseService por Inspector; si falta la referencia, deben emitir warning y hacer no-op, sin crear servicios fallback en runtime.</w:t>
       </w:r>
     </w:p>
     <w:p>
@@ -1432,7 +1432,7 @@
     </w:p>
     <w:p>
       <w:r>
-        <w:t>En Menu.unity, Canvas declara MainMenuManager, SceneLoadService y SaveLoadSceneBinding. MainMenuManager y SaveSlot consumen SaveLoadSceneBinding por interfaces ISaveSlotReader/IGameSessionLoader; SceneLoadService se asigna por Inspector como ISceneLoader. MenuButton y BannerGame inician activos; Play_Panel, OptionsPanel y CreditsPanel inician ocultos. Jugar mantiene MenuButton/BannerGame activos y muestra Play_Panel. Opciones intercambia BannerGame por OptionsPanel y cerrar vuelve a ShowMainMenu. Creditos ejecuta ShowCredits y el Button tambien aplica, por Inspector, BannerGame.SetActive(false) y CreditsPanel.SetActive(true); el cierre ejecuta ShowMainMenu y aplica BannerGame.SetActive(true) / CreditsPanel.SetActive(false). OptionsMenuManager debe tener sliders, fullscreenToggle, soundSettings, graphicsSettings y settingsServiceBehaviour asignados por Inspector. En Menu.unity, GraphicsSettings.brightnessOverlay apunta a Canvas/ZZ_BrightnessOverlay_RuntimeVisual para que BrightnessSlider cambie el brillo visual en tiempo real: 0.6 es neutral con alpha 0, 0 oscurece con negro alpha 242/255 y 1 aclara con blanco alpha 8/255. SaveSlot separa modos NewGame y LoadGame para crear o cargar partida.</w:t>
+        <w:t>En Menu.unity, Canvas declara MainMenuManager, SceneLoadService y SaveLoadSceneBinding. MainMenuManager y SaveSlot consumen SaveLoadSceneBinding por interfaces ISaveSlotReader/IGameSessionLoader; SceneLoadService se asigna por Inspector como ISceneLoader. MenuButton y BannerGame inician activos; Play_Panel, OptionsPanel y CreditsPanel inician ocultos. Jugar mantiene MenuButton/BannerGame activos y muestra Play_Panel. Opciones intercambia BannerGame por OptionsPanel y cerrar vuelve a ShowMainMenu. Creditos ejecuta ShowCredits y el Button tambien aplica, por Inspector, BannerGame.SetActive(false) y CreditsPanel.SetActive(true); el cierre ejecuta ShowMainMenu y aplica BannerGame.SetActive(true) / CreditsPanel.SetActive(false). OptionsMenuManager debe tener sliders, fullscreenToggle, soundSettings, graphicsSettings y settingsServiceBehaviour asignados por Inspector. En Menu.unity, GraphicsSettings.brightnessOverlay apunta a Canvas/ZZ_BrightnessOverlay_RuntimeVisual para que BrightnessSlider cambie el brillo visual en tiempo real: 0.6 es neutral con alpha 0, 0 oscurece con negro alpha 242/255 y 1 aclara con blanco alpha 8/255. SaveSlot separa modos NewGame y LoadGame para crear o cargar partida. La carga de escenas no tiene fallback UnitySceneLoader: cada escena debe declarar SceneLoadService por Inspector y cualquier ausencia debe ser visible como warning + no-op.</w:t>
       </w:r>
     </w:p>
     <w:p>
@@ -5267,6 +5267,11 @@
       </w:pPr>
       <w:r>
         <w:t>Interaction y Scanner</w:t>
+      </w:r>
+    </w:p>
+    <w:p>
+      <w:r>
+        <w:t>ScannerTrigger debe recibir pivotScan, scanAnimator y scanRenderer por Inspector. No debe buscar Renderer en hijos; si falta una referencia visual, emite warning y hace no-op parcial. El scanner sigue desacoplado: Interaction publica feedback por ScannerFeedbackEventChannel_SO y ScannerTrigger solo presenta visual/audio. Los assets de animacion/controladores del scanner viven en Assets/Project/Animations/Scanner, no bajo carpetas Scripts.</w:t>
       </w:r>
     </w:p>
     <w:p>
@@ -9054,7 +9059,12 @@
         <w:pStyle w:val="ListBullet"/>
       </w:pPr>
       <w:r>
-        <w:t>PlayerAnimatorPresenter lee MovementController y actualiza el Animator del modelo 3P. No lee input directamente y no mueve al jugador; tambien controla la inclinacion visual del robot durante jetpack desde una referencia Visual Tilt Root asignada por Inspector.</w:t>
+        <w:t>PlayerAnimatorPresenter lee MovementController y actualiza el Animator del modelo 3P. No lee input directamente y no mueve al jugador; tambien controla la inclinacion visual del robot durante jetpack desde una referencia Visual Tilt Root asignada por Inspector. Valida el contrato minimo del Animator y emite warnings si faltan parametros o controller.</w:t>
+      </w:r>
+    </w:p>
+    <w:p>
+      <w:r>
+        <w:t>Contrato Animator del visual 3P: parametros Speed(float), Grounded(bool), Jump(bool), FreeFall(bool), MotionSpeed(float), y estado Idle Walk Run Blend en layer 0 para jetpack. Si falta algo, PlayerAnimatorPresenter emite warning y hace no-op parcial sin mover al jugador ni inventar dependencias.</w:t>
       </w:r>
     </w:p>
     <w:p>
@@ -9062,7 +9072,7 @@
         <w:pStyle w:val="ListBullet"/>
       </w:pPr>
       <w:r>
-        <w:t>PlayerAnimatorPresenter activa Jump por velocidad vertical positiva real usando MovementController.GetVerticalSpeed y un umbral interno pequeno. Esto evita que la animacion espere el fin de groundedGraceTime sin agregar una perilla de Inspector. FreeFall queda reservado para caida real: no grounded, velocidad vertical negativa suficiente, delay de aire cumplido y sin jetpack efectivo.</w:t>
+        <w:t>PlayerAnimatorPresenter activa Jump por velocidad vertical positiva real usando MovementController.GetVerticalSpeed y un umbral interno pequeno. FreeFall queda reservado para caida real: no grounded, velocidad vertical negativa suficiente y sin jetpack efectivo. Durante jetpack efectivo, intenta volver al estado Idle Walk Run Blend y mantiene el visual en locomocion idle con tilt direccional.</w:t>
       </w:r>
     </w:p>
     <w:p>
@@ -9112,7 +9122,7 @@
     </w:p>
     <w:p>
       <w:r>
-        <w:t>PlayerCameraMotion vive en Main Camera, lee MovementController por Inspector y se sincroniza con PlayerFootstepAnimationEvents.FootstepReceived. Cada AnimationEvent OnFootstep dispara un pulso local suave de camara si hay input de movimiento, grounded y jetpack inactivo. stepDuration define la duracion del pulso y smoothTime suaviza la transicion. No controla input, yaw/pitch ni offsets de perspectiva; PlayerPerspectiveController conserva el offset base y PlayerCameraRig conserva la rotacion de vista.</w:t>
+        <w:t>PlayerCameraMotion vive en Main Camera, lee MovementController por Inspector y se sincroniza con PlayerFootstepAnimationEvents.FootstepReceived. Cada AnimationEvent OnFootstep dispara un pulso local suave de camara si hay input de movimiento, grounded y jetpack inactivo. No calcula ritmo propio ni altera yaw/pitch; PlayerPerspectiveController conserva el offset base de primera/tercera persona.</w:t>
       </w:r>
     </w:p>
     <w:p>
@@ -9159,7 +9169,7 @@
     </w:p>
     <w:p>
       <w:r>
-        <w:t>Los clips de locomocion del robot emiten AnimationEvent OnFootstep. El componente PlayerFootstepAnimationEvents vive en el GameObject Robot que contiene el Animator y delega en PlayerAudioFeedback. PlayerAudioFeedback conserva la decision de superficie, pitch y AudioCueKey, mientras AudioService reproduce el cue como one-shot. No se reintroducen scripts StarterAssets ni audio acoplado al controlador de movimiento.</w:t>
+        <w:t>Los clips de locomocion del robot emiten AnimationEvent OnFootstep. El componente PlayerFootstepAnimationEvents vive en el GameObject Robot que contiene el Animator y delega en PlayerAudioFeedback para audio, y publica FootstepReceived para PlayerCameraMotion. Esta es la unica fuente de pasos.</w:t>
       </w:r>
     </w:p>
     <w:p>
@@ -9172,7 +9182,7 @@
     </w:p>
     <w:p>
       <w:r>
-        <w:t>El mismo componente PlayerFootstepAnimationEvents tambien recibe AnimationEvent OnLand desde JumpLand y delega en PlayerAudioFeedback.PlayLanding. Esto evita warnings de Unity sin reintroducir scripts importados y mantiene la seleccion de superficie/audio en PlayerAudioFeedback.</w:t>
+        <w:t>PlayerFootstepAnimationEvents tambien recibe AnimationEvent OnLand desde JumpLand y delega en PlayerAudioFeedback.PlayLanding. Esto evita warnings de Unity sin reintroducir scripts importados y mantiene la seleccion de superficie/audio en PlayerAudioFeedback.</w:t>
       </w:r>
     </w:p>
     <w:p>
@@ -9185,7 +9195,7 @@
     </w:p>
     <w:p>
       <w:r>
-        <w:t>MovementController publica OnJumped cuando recibe una solicitud de salto valida estando grounded. PlayerAudioFeedback escucha ese evento y reproduce PlayerJump o PlayerMetalJump como one-shot. El aterrizaje puede sonar por OnLand del Animator o por OnLanded del MovementController.</w:t>
+        <w:t>No debe reproducirse sonido al iniciar el salto. El sonido de aterrizaje viene de OnLand del Animator visual, no de timers ni de eventos de salto del MovementController.</w:t>
       </w:r>
     </w:p>
     <w:p>
@@ -9211,7 +9221,7 @@
     </w:p>
     <w:p>
       <w:r>
-        <w:t>PlayerAudioFeedback no reproduce cada AnimationEvent ciegamente: filtra pasos por velocidad horizontal minima e intervalo minimo distinto para caminar/correr. El aterrizaje usa OnLand del Animator como fuente principal y desactiva el duplicado de MovementController.OnLanded salvo que se cambie landingUsesAnimationEvent.</w:t>
+        <w:t>PlayerFootstepAnimationEvents filtra duplicados muy cercanos para evitar rafagas por blending/transiciones del Animator. PlayerAudioFeedback no calcula ritmo de pasos; solo decide superficie, pitch y AudioCueKey cuando recibe OnFootstep/OnLand.</w:t>
       </w:r>
     </w:p>
     <w:p>
@@ -9224,12 +9234,12 @@
     </w:p>
     <w:p>
       <w:r>
-        <w:t>Los pasos y aterrizajes del Player no deben depender de timers de locomocion, velocidad minima ni eventos de salto del MovementController. La fuente de verdad para Walk/Run/Land es el Animator mediante OnFootstep y OnLand. PlayerFootstepAnimationEvents solo filtra duplicados muy cercanos para evitar rafagas por blending/transiciones del Animator. El jetpack sigue siendo la unica excepcion porque es audio sostenido por estado.</w:t>
+        <w:t>Los pasos y aterrizajes del Player no deben depender de timers de locomocion, velocidad minima ni eventos de salto del MovementController. La fuente de verdad para Walk/Run/Land es el Animator mediante OnFootstep y OnLand. PlayerCameraMotion usa esos mismos pasos para sincronizar el movimiento de camara.</w:t>
       </w:r>
     </w:p>
     <w:p>
       <w:r>
-        <w:t>SaveLoad: SaveParticipantRegistry solo lista ISaveParticipant directos. InventoryController no se registra directo; PlayerSaveParticipant lo envuelve junto con transform, vida, jetpack y timer. HealthBehaviour tolera restore antes de Awake inicializando HealthComponent de forma perezosa. ScannerTrigger valida Animator activo/inicializado/con controller antes de SetTrigger/ResetTrigger.</w:t>
+        <w:t>SaveLoad: SaveParticipantRegistry lista ISaveParticipant directos en participantBehaviours. Si hay participantes explicitos validos, no hace auto-descubrimiento. InventoryController no se registra directo; PlayerSaveParticipant lo envuelve junto con transform, vida, jetpack y timer. QuestSystem se registra explicitamente si el progreso de misiones debe persistir. RunProjectHealthCheck valida que cualquier QuestSystem en escenas/prefabs de Assets/Project este incluido en SaveParticipantRegistry.participantBehaviours.</w:t>
       </w:r>
     </w:p>
     <w:p>
@@ -9248,6 +9258,45 @@
     <w:p>
       <w:r>
         <w:t>Menu.unity resuelve sonidos UI desde AudioService de escena en Canvas, con Audio Cue Library_SO asignada y defaultOutputGroup apuntando al grupo SFX de MainMixer. ButtonAccessibility consume IAudioService por Inspector para UIHover/UIClick y SegmentedSliderInteractive usa el mismo servicio para UISliderTick/UISliderLimit. Los AudioCue_SO de menu viven en Assets/Project/ScriptableObjects/Audio/Sounds/Menu y se referencian desde AudioCueLibrary_SO; no deben quedar campos UI vacios ni buscar servicios globales.</w:t>
+      </w:r>
+    </w:p>
+    <w:p>
+      <w:pPr>
+        <w:pStyle w:val="Heading2"/>
+      </w:pPr>
+      <w:r>
+        <w:t>Actualizacion: loading de entrada a gameplay</w:t>
+      </w:r>
+    </w:p>
+    <w:p>
+      <w:r>
+        <w:t>El loading intermedio del menu pertenece al flujo de SaveSlot. Canvas/LoadingImage inicia oculto; los botones NewGame y LoadGame lo referencian desde SaveSlot. Al presionar un slot valido, SaveSlot desactiva su boton, activa LoadingImage, aplica fade con fadeOutDuration, espera al menos minimumLoadingTime y delega la creacion/carga de sesion en SaveLoadSceneBinding. La transicion no debe saltarse SaveLoad con una carga directa de escena ni depender de MainMenuManager para cargar por indice.</w:t>
+      </w:r>
+    </w:p>
+    <w:p>
+      <w:pPr>
+        <w:pStyle w:val="Heading2"/>
+      </w:pPr>
+      <w:r>
+        <w:t>Actualizacion: fade in de gameplay</w:t>
+      </w:r>
+    </w:p>
+    <w:p>
+      <w:r>
+        <w:t>Pablo_TestMechanics contiene Canvas/SceneFadeInOverlay con SceneFadeInOnStart. El overlay inicia activo en negro, fadeInDuration controla cuanto tarda en pasar a transparente y luego el objeto se desactiva. Este fade de entrada es local a la escena destino y no usa DontDestroyOnLoad ni rutas globales.</w:t>
+      </w:r>
+    </w:p>
+    <w:p>
+      <w:pPr>
+        <w:pStyle w:val="Heading2"/>
+      </w:pPr>
+      <w:r>
+        <w:t>Actualizacion: audio de jetpack por consumo real</w:t>
+      </w:r>
+    </w:p>
+    <w:p>
+      <w:r>
+        <w:t>El loop de audio del jetpack no depende solo del input activo. MovementController expone IsJetpackConsumingFuel, calculado comparando fuel antes y despues del tick de abilities. PlayerAudioFeedback reproduce PlayerJetpack solo mientras hay consumo real de fuel; si el fuel esta en cero o el jetpack no esta aplicando consumo, el loop se detiene.</w:t>
       </w:r>
     </w:p>
     <w:sectPr>

</xml_diff>